<commit_message>
Document GEMM memory planning and optimization progress
</commit_message>
<xml_diff>
--- a/doc/AI_compiler_optimization_design_v0.3.docx
+++ b/doc/AI_compiler_optimization_design_v0.3.docx
@@ -8837,6 +8837,18 @@
       </w:pPr>
       <w:r>
         <w:t>Blackwell FP4 and NVFP4 should be modeled as a tiling and pipeline change, not merely as a smaller dtype. Native FP4 Tensor Core throughput can make compute much cheaper relative to movement, so the winning plan may shift from compute-maximizing tiles toward tiles that better hide value movement, scale metadata movement, synchronization, and epilogue work.</w:t>
+      </w:r>
+    </w:p>
+    <w:p>
+      <w:pPr/>
+      <w:r>
+        <w:t>Precision-changing GEMM candidates require explicit compiler-option authorization. The proposed -DSL:gemm_precision=preserve|allow_narrow mode defaults to preserve; allow_narrow admits numerically permitted, target-supported formats such as FP8, MXFP4, or NVFP4 for consideration but never forces the smallest bit width. A higher-precision source also requires a region-specific numerical acceptance contract or validated quantization recipe. Hardware capability, -DSL:quant, and cost-model preference alone do not authorize reduced precision. The source-format plan remains the baseline and fallback.</w:t>
+      </w:r>
+    </w:p>
+    <w:p>
+      <w:pPr/>
+      <w:r>
+        <w:t>The target profile describes supported input/scale/accumulator/output formats, instruction shapes, layouts, movement requirements, and resource/cost terms. Common candidate and plan records carry option provenance and legality evidence, while AI policy owns the model-quality criterion. The hardware detail design specifies the proposed option and its gates; neither the option nor operand conversion is implemented yet.</w:t>
       </w:r>
     </w:p>
     <w:p>

</xml_diff>

<commit_message>
Implement AI matmul trace and selected tile WHIRL lowering
</commit_message>
<xml_diff>
--- a/doc/AI_compiler_optimization_design_v0.3.docx
+++ b/doc/AI_compiler_optimization_design_v0.3.docx
@@ -39,7 +39,7 @@
         <w:spacing w:after="120"/>
       </w:pPr>
       <w:r>
-        <w:t>Status: v0.3 adds a phase-by-phase optimization reporting contract and identifies trace fields still needed for a trustworthy cross-phase report. The 2026-10-18 amendment fixes the matmul-first trace, report, and durable-artifact conventions in Section 9.7. The compact, positional WOPT trace and report generator remain design proposals, not implemented compiler features. Research-derived inspiration and DSC design proposals remain distinct.</w:t>
+        <w:t>Status: v0.3 adds a phase-by-phase optimization reporting contract and identifies trace fields still needed for a trustworthy cross-phase report. The 2026-10-18 amendment fixes the matmul-first trace, report, and durable-artifact conventions in Section 9.7. The 2026-10-21 amendment adds the predicted and measured Roofline contract in Section 7.2A. AIO-9 has a compact WOPT-style selection trace and a tile-phase report; full cross-phase coverage and Roofline reporting remain proposals. Research-derived inspiration and DSC design proposals remain distinct.</w:t>
       </w:r>
     </w:p>
     <w:p>
@@ -4003,13 +4003,11 @@
             <w:pPr>
               <w:spacing w:after="0"/>
             </w:pPr>
-            <w:r/>
-            <w:r>
-              <w:rPr>
-                <w:b w:val="0"/>
+            <w:r>
+              <w:rPr>
                 <w:sz w:val="15"/>
               </w:rPr>
-              <w:t>Compute, memory, communication, sync, launch, overlap, resource, and confidence estimates.</w:t>
+              <w:t>Compute, memory, communication, sync, launch, overlap, resource, and confidence estimates. Embed per-tier Roofline evidence: work, traffic, arithmetic intensity, bandwidth and compute ceilings, bound, provenance, and uncertainty; do not turn the bound into an additive latency term.</w:t>
             </w:r>
           </w:p>
         </w:tc>
@@ -4092,13 +4090,11 @@
             <w:pPr>
               <w:spacing w:after="0"/>
             </w:pPr>
-            <w:r/>
-            <w:r>
-              <w:rPr>
-                <w:b w:val="0"/>
+            <w:r>
+              <w:rPr>
                 <w:sz w:val="15"/>
               </w:rPr>
-              <w:t>Tier scope, capacity, bandwidth, latency, granularity, alignment, bank structure, async capability.</w:t>
+              <w:t>Tier scope, capacity, sustainable bandwidth by transfer path, latency, granularity, alignment, bank structure, async capability, and calibration provenance. Capacity is not a bandwidth estimate.</w:t>
             </w:r>
           </w:p>
         </w:tc>
@@ -4178,13 +4174,11 @@
             <w:pPr>
               <w:spacing w:after="0"/>
             </w:pPr>
-            <w:r/>
-            <w:r>
-              <w:rPr>
-                <w:b w:val="0"/>
+            <w:r>
+              <w:rPr>
                 <w:sz w:val="15"/>
               </w:rPr>
-              <w:t>Device, SM, vector unit, tensor core, thread, warp, CTA, stream, and occupancy-relevant resource descriptions.</w:t>
+              <w:t>Device, SM, vector unit, tensor core, thread, warp, CTA, stream, and occupancy-relevant resource descriptions, including instruction-path and dtype-specific sustained compute ceilings.</w:t>
             </w:r>
           </w:p>
         </w:tc>
@@ -8396,6 +8390,59 @@
     <w:p>
       <w:pPr>
         <w:pStyle w:val="Heading2"/>
+        <w:keepNext/>
+      </w:pPr>
+      <w:r>
+        <w:t>7.2A Roofline Bound And Data Supply Contract</w:t>
+      </w:r>
+    </w:p>
+    <w:p>
+      <w:pPr>
+        <w:keepLines/>
+      </w:pPr>
+      <w:r>
+        <w:t>Roofline is a lower bound on execution time and a diagnostic for a complete OptimizationPlanIR, not another term to add to the latency equation. For a candidate, let W be the counted floating-point operations on the code path being evaluated. For each memory level L with B_L &gt; 0, let B_L be the bytes predicted to cross that level, I_L = W / B_L its arithmetic intensity, and beta_L the sustainable bandwidth available to that path. Let pi_path be the sustained compute ceiling for the actual instruction family and dtype. Then:</w:t>
+      </w:r>
+    </w:p>
+    <w:p>
+      <w:pPr/>
+      <w:r>
+        <w:t>P_roof = min(pi_path, min_L(I_L * beta_L))</w:t>
+      </w:r>
+    </w:p>
+    <w:p>
+      <w:pPr/>
+      <w:r>
+        <w:t>T_roof = max(W / pi_path, max_L(B_L / beta_L))</w:t>
+      </w:r>
+    </w:p>
+    <w:p>
+      <w:pPr/>
+      <w:r>
+        <w:t>The data-availability metric is beta_L in bytes per second, not memory capacity. The compiler may also report beta_required,L = pi_path / I_L to show the bandwidth needed to sustain the compute ceiling. Capacity, cache residency, occupancy, coalescing, shared-memory banking, and concurrent consumers influence B_L or attainable beta_L, but are not interchangeable with bandwidth. A published peak and a calibrated sustainable ceiling are distinct evidence classes. The target profile must name the specific device, relevant clocks, memory path, instruction path, calibration method, and confidence; a generic Hopper or Blackwell capacity envelope is not a calibrated Roofline target.</w:t>
+      </w:r>
+    </w:p>
+    <w:p>
+      <w:pPr/>
+      <w:r>
+        <w:t>CommonTilePlanIR supplies W and logical movement by tile and stage. CommonFetchPlanIR and CommonPipelineIR identify the actual movement path. CandidateCostIR carries a per-level Roofline evidence record with predicted read/write bytes, cache-policy assumptions, arithmetic intensity, ceiling values and units, limiting resource, bound, provenance, and uncertainty. MemoryHierarchyDescriptorIR and ComputeResourceIR own reusable performance-capability fields; NVIDIA target adapters own SKU-specific calibrations. AI-specific semantics supply GEMM/attention/MoE operation counts, dtype behavior, scale metadata, and workload-state distributions. Global load requests are not automatically HBM bytes: an L2 hit changes the HBM denominator. Emit separate HBM, L2, and shared-memory intensities or mark a level unavailable. Do not mix a tensor-core peak with a scalar/vector FMA candidate.</w:t>
+      </w:r>
+    </w:p>
+    <w:p>
+      <w:pPr/>
+      <w:r>
+        <w:t>The compiler can construct a predicted Roofline before GPU execution using modeled B_L and documented or calibrated ceilings. It must label the result predicted, carry cold/warm cache or other traffic scenarios when uncertain, and reject impossible predictions such as a modeled kernel time below T_roof under the same assumptions. The bound does not prove a candidate profitable: small GEMMs may be limited by launch latency, insufficient CTA waves, dependency stalls, or pipeline fill/drain, none of which the classical steady-state Roofline explains. Keep the scheduled latency model in Section 7.2 as the profitability estimate and use Roofline to check its consistency and explain headroom. The current AIO-9 relative score and selection_reason=lowest_complete_relative_cost must not be relabeled as Roofline-derived latency.</w:t>
+      </w:r>
+    </w:p>
+    <w:p>
+      <w:pPr/>
+      <w:r>
+        <w:t>To measure effectiveness, compile and run the baseline and alternatives as comparable GPU kernels on the same device, verify numerical results, and retain kernel time, actual instruction path, resource use, and observed traffic at each available memory level. Join those measurements to the compile-time plan and source identity. Plot observed intensity W / B_observed,L and achieved performance W / T_kernel against the matching measured or calibrated ceiling. Report Roofline efficiency P_achieved / P_roof, model error T_predicted versus T_kernel, and whether the selected plan actually outranks rejected candidates. A GPU Roofline must not use the current direct CPU fallback as its GPU baseline. Profiling changes execution conditions, so preserve unprofiled timing separately from counter collection. Where no native GPU evidence exists, report measured=unavailable, not an inferred speedup.</w:t>
+      </w:r>
+    </w:p>
+    <w:p>
+      <w:pPr>
+        <w:pStyle w:val="Heading2"/>
       </w:pPr>
       <w:r>
         <w:t>7.3 Profitability Decision Timing</w:t>
@@ -11627,10 +11674,8 @@
             <w:pPr>
               <w:spacing w:after="0"/>
             </w:pPr>
-            <w:r/>
-            <w:r>
-              <w:rPr>
-                <w:b w:val="0"/>
+            <w:r>
+              <w:rPr>
                 <w:sz w:val="15"/>
               </w:rPr>
               <w:t>AI-P7 Multi-level tiling</w:t>
@@ -11655,13 +11700,11 @@
             <w:pPr>
               <w:spacing w:after="0"/>
             </w:pPr>
-            <w:r/>
-            <w:r>
-              <w:rPr>
-                <w:b w:val="0"/>
+            <w:r>
+              <w:rPr>
                 <w:sz w:val="15"/>
               </w:rPr>
-              <w:t>Baseline and tile candidates, legal and resource failures, cost terms, winner versus baseline, expected gain, and confidence.</w:t>
+              <w:t>Baseline and all tile candidates, legal and resource failures, cost terms, winner versus baseline, expected gain, confidence, and predicted Roofline work/traffic/intensity by memory level where inputs exist.</w:t>
             </w:r>
           </w:p>
         </w:tc>
@@ -11683,13 +11726,11 @@
             <w:pPr>
               <w:spacing w:after="0"/>
             </w:pPr>
-            <w:r/>
-            <w:r>
-              <w:rPr>
-                <w:b w:val="0"/>
+            <w:r>
+              <w:rPr>
                 <w:sz w:val="15"/>
               </w:rPr>
-              <w:t>CAND, LEGAL, COST, SELECT; baseline and confidence required.</w:t>
+              <w:t>CAND, LEGAL, COST, SELECT; Roofline ceilings and per-level byte provenance need a versioned trace extension.</w:t>
             </w:r>
           </w:p>
         </w:tc>
@@ -11977,10 +12018,8 @@
             <w:pPr>
               <w:spacing w:after="0"/>
             </w:pPr>
-            <w:r/>
-            <w:r>
-              <w:rPr>
-                <w:b w:val="0"/>
+            <w:r>
+              <w:rPr>
                 <w:sz w:val="15"/>
               </w:rPr>
               <w:t>AI-P11 Telemetry and profile feedback</w:t>
@@ -12005,13 +12044,11 @@
             <w:pPr>
               <w:spacing w:after="0"/>
             </w:pPr>
-            <w:r/>
-            <w:r>
-              <w:rPr>
-                <w:b w:val="0"/>
+            <w:r>
+              <w:rPr>
                 <w:sz w:val="15"/>
               </w:rPr>
-              <w:t>Observed latency and traffic versus predictions, model error by term, variant hit rate, and next tuning action.</w:t>
+              <w:t>Observed latency and per-level traffic versus predictions; achieved versus predicted Roofline position, efficiency, selection-ranking error, model error by cost term, variant hit rate, and next tuning action.</w:t>
             </w:r>
           </w:p>
         </w:tc>
@@ -12033,13 +12070,11 @@
             <w:pPr>
               <w:spacing w:after="0"/>
             </w:pPr>
-            <w:r/>
-            <w:r>
-              <w:rPr>
-                <w:b w:val="0"/>
+            <w:r>
+              <w:rPr>
                 <w:sz w:val="15"/>
               </w:rPr>
-              <w:t>External profile join; compile-only trace reports unavailable.</w:t>
+              <w:t>External measured profile joined to compile trace and target calibration identity; a compile-only .t file must report measurements as unavailable.</w:t>
             </w:r>
           </w:p>
         </w:tc>
@@ -12094,7 +12129,7 @@
         <w:spacing w:after="60"/>
       </w:pPr>
       <w:r>
-        <w:t>Profitability evidence: record cost-model source, confidence or missing-cost flag, target/resource assumptions, baseline and selected totals, and each rejection reason. Preserve raw and unhidden memory/communication separately; compare whole plans under the same assumptions.</w:t>
+        <w:t>Profitability evidence: record cost-model source, confidence or missing-cost flag, target/resource assumptions, baseline and selected totals, and the reason for each rejection. Preserve raw and unhidden memory/communication separately; compute gain from comparable whole plans under the same assumptions. For Roofline, retain unscaled FLOPs, predicted bytes per memory level, matched sustained compute/bandwidth ceilings, assumptions, and provenance; the existing scaled relative-cost columns cannot reconstruct a validated Roofline.</w:t>
       </w:r>
     </w:p>
     <w:p>
@@ -13695,7 +13730,7 @@
         <w:spacing w:after="120"/>
       </w:pPr>
       <w:r>
-        <w:t>Add hardware calibration sources, benchmark kernels, fitted parameters, confidence intervals, and fallback heuristics.</w:t>
+        <w:t>Add hardware calibration sources, benchmark kernels, fitted parameters, confidence intervals, and fallback heuristics. Maintain versioned, device-specific compute ceilings by dtype/instruction path and sustainable bandwidth ceilings by HBM, L2, shared-memory path, transfer engine, clock regime, and relevant occupancy range. Record whether a ceiling is a published specification, independent microbenchmark, or fitted observation. Compare predicted and observed per-level bytes before fitting latency; otherwise a cache-traffic error can be mistaken for a bandwidth error. Test candidate ranking and Roofline efficiency across multiple M/N/K shapes, edge tiles, cold/warm cache states, and pipeline depths. Keep a held-out shape set and preserve unprofiled timing separately from profiler counter runs. Do not promote Roofline-based selection from exploratory to cost-gated until the prediction error, ranking error, and fallback policy have explicit acceptance thresholds.</w:t>
       </w:r>
     </w:p>
     <w:p>
@@ -13939,6 +13974,14 @@
       </w:pPr>
       <w:r>
         <w:t>NVIDIA CUDA and CUTLASS documentation: used as design evidence for explicit GPU hierarchy, occupancy, shared memory, Tensor Core tiling, asynchronous movement, and pipeline constraints.</w:t>
+      </w:r>
+    </w:p>
+    <w:p>
+      <w:pPr>
+        <w:pStyle w:val="ListBullet"/>
+      </w:pPr>
+      <w:r>
+        <w:t>NVIDIA Nsight Compute Profiling Guide, Roofline Charts and Memory Workload Analysis (https://docs.nvidia.com/nsight-compute/ProfilingGuide/): research-derived definition of arithmetic intensity, compute and bandwidth ceilings, hierarchical Roofline and measured achieved performance. Section 7.2A's compiler evidence fields, consistency gate, and selection-feedback use are DSC design proposals, not features attributed to NVIDIA.</w:t>
       </w:r>
     </w:p>
     <w:p>

</xml_diff>

<commit_message>
Refine AI WHIRL CUDA source design
</commit_message>
<xml_diff>
--- a/doc/AI_compiler_optimization_design_v0.3.docx
+++ b/doc/AI_compiler_optimization_design_v0.3.docx
@@ -39,7 +39,7 @@
         <w:spacing w:after="120"/>
       </w:pPr>
       <w:r>
-        <w:t>Status: v0.3 adds a phase-by-phase optimization reporting contract and identifies trace fields still needed for a trustworthy cross-phase report. The 2026-10-18 amendment fixes the matmul-first trace, report, and durable-artifact conventions in Section 9.7. The 2026-10-21 amendment adds the predicted and measured Roofline contract in Section 7.2A. AIO-9 has a compact WOPT-style selection trace and a tile-phase report; full cross-phase coverage and Roofline reporting remain proposals. Research-derived inspiration and DSC design proposals remain distinct.</w:t>
+        <w:t>Status: v0.3 adds a phase-by-phase optimization reporting contract and identifies trace fields still needed for a trustworthy cross-phase report. The 2026-10-18 amendment fixes the matmul-first trace, report, and durable-artifact conventions in Section 9.7. The 2026-10-21 amendments add the predicted and measured Roofline contract in Section 7.2A, the high-level WHIRL/NVISA convergence contract in Section 6B, and the accepted `whirl2c -cuda` source-emission direction in Section 6B.5. The design retains the existing `.cu` emitter as a migration baseline and specifies a default-on control for it; neither implies that device WHIRL is complete. AIO-9 has a compact WOPT-style selection trace and a tile-phase report; full cross-phase coverage, Roofline reporting, and WHIRL device-loop lowering remain proposals. Research-derived inspiration and DSC design proposals remain distinct.</w:t>
       </w:r>
     </w:p>
     <w:p>
@@ -72,6 +72,11 @@
       </w:pPr>
       <w:r>
         <w:t>The recommended implementation priority is now action-gated: first build the measurement harness, then implement one real tiling rewrite, one real fusion rewrite, the P7.4/P8 pipeline path, cost-model calibration, runtime variants, and only then broaden into distributed parallelization.</w:t>
+      </w:r>
+    </w:p>
+    <w:p>
+      <w:r>
+        <w:t>The matmul-generated CUDA currently contains the selected tile loops, but the corresponding WHIRL records a generated-provider call and plan metadata rather than a device-kernel loop nest. A detached K-tile `DO_LOOP` used to drive source bounds is transitional evidence, not the executable kernel. The next representation milestone is to materialize a complete, structured device-kernel program unit (PU) in high-level WHIRL after plan selection, preserving loop, memory-space, ownership, and synchronization facts until target lowering. The accepted destination is `whirl2c -cuda`: CUDA C must ultimately be derived from that selected device PU. Until then, the current emitter should remain available behind a default-on option as a clearly labeled verification baseline. Section 6B defines this boundary and the NVISA reuse investigation.</w:t>
       </w:r>
     </w:p>
     <w:p>
@@ -1362,20 +1367,8 @@
             </w:tcBorders>
           </w:tcPr>
           <w:p>
-            <w:pPr>
-              <w:spacing w:after="0"/>
-            </w:pPr>
-            <w:r>
-              <w:rPr>
-                <w:sz w:val="17"/>
-              </w:rPr>
-            </w:r>
-            <w:r>
-              <w:rPr>
-                <w:b w:val="0"/>
-                <w:sz w:val="17"/>
-              </w:rPr>
-              <w:t>Select the physical kernel plan, final fusion boundaries, launch structure, stream assignment, synchronization points, and instruction-level schedule constraints.</w:t>
+            <w:r>
+              <w:t>Select the complete costed plan; materialize a high-level WHIRL device-kernel PU with explicit loops, memory spaces, and synchronization; then choose final fusion boundaries, launch structure, stream assignment, and target schedule constraints.</w:t>
             </w:r>
           </w:p>
         </w:tc>
@@ -4358,6 +4351,38 @@
           </w:p>
         </w:tc>
       </w:tr>
+      <w:tr>
+        <w:tc>
+          <w:tcPr>
+            <w:tcW w:type="dxa" w:w="3389"/>
+          </w:tcPr>
+          <w:p>
+            <w:r>
+              <w:t>High-level WHIRL device-kernel lowering contract</w:t>
+            </w:r>
+          </w:p>
+        </w:tc>
+        <w:tc>
+          <w:tcPr>
+            <w:tcW w:type="dxa" w:w="3389"/>
+          </w:tcPr>
+          <w:p>
+            <w:r>
+              <w:t>Common Compiler Substrate</w:t>
+            </w:r>
+          </w:p>
+        </w:tc>
+        <w:tc>
+          <w:tcPr>
+            <w:tcW w:type="dxa" w:w="3389"/>
+          </w:tcPr>
+          <w:p>
+            <w:r>
+              <w:t>Bind a selected plan ID to a device PU and to structured loop IDs, memory-space and alias facts, synchronization dependencies, source provenance, and verification results. Reuse WHIRL nodes and symbol attributes rather than creating a competing kernel AST. Target-specific NVIDIA operations remain backend extensions.</w:t>
+            </w:r>
+          </w:p>
+        </w:tc>
+      </w:tr>
     </w:tbl>
     <w:p/>
     <w:p>
@@ -5123,6 +5148,14 @@
     <w:p>
       <w:pPr>
         <w:pStyle w:val="ListBullet"/>
+      </w:pPr>
+      <w:r>
+        <w:t>High-level WHIRL owns executable structured loops and typed memory operations after selection. Plan IR owns alternatives and estimated costs before selection; the target backend owns PTX/CUDA-specific instruction realization. Neither plan metadata nor a host-side generated-provider call substitutes for a device-kernel WHIRL PU.</w:t>
+      </w:r>
+    </w:p>
+    <w:p>
+      <w:pPr>
+        <w:pStyle w:val="ListBullet"/>
         <w:spacing w:after="60"/>
       </w:pPr>
       <w:r>
@@ -6074,16 +6107,8 @@
             </w:tcBorders>
           </w:tcPr>
           <w:p>
-            <w:pPr>
-              <w:spacing w:after="0"/>
-            </w:pPr>
-            <w:r/>
-            <w:r>
-              <w:rPr>
-                <w:b w:val="0"/>
-                <w:sz w:val="15"/>
-              </w:rPr>
-              <w:t>OptimizationPlanIR, CommonPipelineIR, ComputeResourceIR</w:t>
+            <w:r>
+              <w:t>OptimizationPlanIR, CommonPipelineIR, ComputeResourceIR, high-level WHIRL device PU</w:t>
             </w:r>
           </w:p>
         </w:tc>
@@ -6102,16 +6127,8 @@
             </w:tcBorders>
           </w:tcPr>
           <w:p>
-            <w:pPr>
-              <w:spacing w:after="0"/>
-            </w:pPr>
-            <w:r/>
-            <w:r>
-              <w:rPr>
-                <w:b w:val="0"/>
-                <w:sz w:val="15"/>
-              </w:rPr>
-              <w:t>Final physical realization</w:t>
+            <w:r>
+              <w:t>Cost-gated plan selection, structured device-loop materialization, final physical realization</w:t>
             </w:r>
           </w:p>
         </w:tc>
@@ -8242,6 +8259,423 @@
         <w:pStyle w:val="Heading1"/>
       </w:pPr>
       <w:r>
+        <w:t>6B High-Level WHIRL And NVISA Convergence</w:t>
+      </w:r>
+    </w:p>
+    <w:p>
+      <w:pPr>
+        <w:pStyle w:val="Heading2"/>
+      </w:pPr>
+      <w:r>
+        <w:t>6B.1 Current Gap And Design Hypothesis</w:t>
+      </w:r>
+    </w:p>
+    <w:p>
+      <w:pPr/>
+      <w:r>
+        <w:t>The current matmul `.cu` output contains the outer reduction-tile loop, cooperative A/B loads, barriers, compute loops, and output stores. In the corresponding WHIRL, the selected path is a host-side generated-provider call plus plan metadata; the device loops are emitted as source text. This is useful for external CUDA compilation and review, but it does not let Open64's loop and dependence analyses inspect or transform the selected kernel. A `for` loop in a generated file is not evidence of a `DO_LOOP` in WHIRL.</w:t>
+      </w:r>
+    </w:p>
+    <w:p>
+      <w:pPr/>
+      <w:r>
+        <w:t>The design hypothesis is that preserving structured loops and memory facts in WHIRL through AI-P9 will make plan refinement, legality checking, tracing, and target lowering more effective than lowering this workload prematurely to a low-level control-flow IR. The relevant NVIDIA comparison is nvcc's LLVM-based NVVM path, not MLIR: NVIDIA announced the LLVM-based CUDA compiler with CUDA Toolkit 4.1 in December 2011, and its NVVM specification describes an LLVM-based GPU IR and PTX generator. We should compare the information our path preserves and the generated results without assuming visibility into proprietary nvcc passes. The intended Open64 advantage is an integrated, cost-gated path from semantic tensors and LNO-style loop reasoning to a target kernel, with less reconstruction of lost structure. This remains a hypothesis, not a demonstrated performance claim.</w:t>
+      </w:r>
+    </w:p>
+    <w:p>
+      <w:r>
+        <w:t>MLIR affine, structured-control-flow, and transform dialects are a separate, later architectural comparison, especially for Triton-like compilers. Their existence does not make nvcc an MLIR-based compiler and should not be used to answer a claim specifically about nvcc/NVVM.</w:t>
+      </w:r>
+    </w:p>
+    <w:p>
+      <w:pPr>
+        <w:pStyle w:val="Heading2"/>
+      </w:pPr>
+      <w:r>
+        <w:t>6B.2 Representation And Ownership Contract</w:t>
+      </w:r>
+    </w:p>
+    <w:tbl>
+      <w:tblPr>
+        <w:tblW w:type="auto" w:w="0"/>
+        <w:tblLook w:firstColumn="1" w:firstRow="1" w:lastColumn="0" w:lastRow="0" w:noHBand="0" w:noVBand="1" w:val="04A0"/>
+        <w:tblBorders>
+          <w:top w:val="single" w:sz="4" w:color="D9D9D9"/>
+          <w:left w:val="single" w:sz="4" w:color="D9D9D9"/>
+          <w:bottom w:val="single" w:sz="4" w:color="D9D9D9"/>
+          <w:right w:val="single" w:sz="4" w:color="D9D9D9"/>
+          <w:insideH w:val="single" w:sz="4" w:color="D9D9D9"/>
+          <w:insideV w:val="single" w:sz="4" w:color="D9D9D9"/>
+        </w:tblBorders>
+      </w:tblPr>
+      <w:tblGrid>
+        <w:gridCol w:w="3389"/>
+        <w:gridCol w:w="3389"/>
+        <w:gridCol w:w="3389"/>
+      </w:tblGrid>
+      <w:tr>
+        <w:trPr>
+          <w:cantSplit/>
+          <w:tblHeader w:val="true"/>
+        </w:trPr>
+        <w:tc>
+          <w:tcPr>
+            <w:tcW w:type="dxa" w:w="3389"/>
+            <w:shd w:fill="E8EDF2"/>
+          </w:tcPr>
+          <w:p>
+            <w:r>
+              <w:rPr>
+                <w:b/>
+                <w:sz w:val="17"/>
+              </w:rPr>
+              <w:t>Layer</w:t>
+            </w:r>
+          </w:p>
+        </w:tc>
+        <w:tc>
+          <w:tcPr>
+            <w:tcW w:type="dxa" w:w="3389"/>
+            <w:shd w:fill="E8EDF2"/>
+          </w:tcPr>
+          <w:p>
+            <w:r>
+              <w:rPr>
+                <w:b/>
+                <w:sz w:val="17"/>
+              </w:rPr>
+              <w:t>Required representation</w:t>
+            </w:r>
+          </w:p>
+        </w:tc>
+        <w:tc>
+          <w:tcPr>
+            <w:tcW w:type="dxa" w:w="3389"/>
+            <w:shd w:fill="E8EDF2"/>
+          </w:tcPr>
+          <w:p>
+            <w:r>
+              <w:rPr>
+                <w:b/>
+                <w:sz w:val="17"/>
+              </w:rPr>
+              <w:t>Owner and commit point</w:t>
+            </w:r>
+          </w:p>
+        </w:tc>
+      </w:tr>
+      <w:tr>
+        <w:trPr>
+          <w:cantSplit/>
+        </w:trPr>
+        <w:tc>
+          <w:tcPr>
+            <w:tcW w:type="dxa" w:w="3389"/>
+          </w:tcPr>
+          <w:p>
+            <w:r>
+              <w:rPr>
+                <w:sz w:val="17"/>
+              </w:rPr>
+              <w:t>Candidate planning, AI-P7/P8</w:t>
+            </w:r>
+          </w:p>
+        </w:tc>
+        <w:tc>
+          <w:tcPr>
+            <w:tcW w:type="dxa" w:w="3389"/>
+          </w:tcPr>
+          <w:p>
+            <w:r>
+              <w:rPr>
+                <w:sz w:val="17"/>
+              </w:rPr>
+              <w:t>CommonTilePlanIR, CommonFetchPlanIR, CommonPipelineIR, OptimizationPlanIR, CandidateCostIR; baseline and alternatives remain intact</w:t>
+            </w:r>
+          </w:p>
+        </w:tc>
+        <w:tc>
+          <w:tcPr>
+            <w:tcW w:type="dxa" w:w="3389"/>
+          </w:tcPr>
+          <w:p>
+            <w:r>
+              <w:rPr>
+                <w:sz w:val="17"/>
+              </w:rPr>
+              <w:t>Common substrate; no executable rewrite before whole-plan legality and profitability selection</w:t>
+            </w:r>
+          </w:p>
+        </w:tc>
+      </w:tr>
+      <w:tr>
+        <w:trPr>
+          <w:cantSplit/>
+        </w:trPr>
+        <w:tc>
+          <w:tcPr>
+            <w:tcW w:type="dxa" w:w="3389"/>
+          </w:tcPr>
+          <w:p>
+            <w:r>
+              <w:rPr>
+                <w:sz w:val="17"/>
+              </w:rPr>
+              <w:t>Selected GPU kernel, AI-P9</w:t>
+            </w:r>
+          </w:p>
+        </w:tc>
+        <w:tc>
+          <w:tcPr>
+            <w:tcW w:type="dxa" w:w="3389"/>
+          </w:tcPr>
+          <w:p>
+            <w:r>
+              <w:rPr>
+                <w:sz w:val="17"/>
+              </w:rPr>
+              <w:t>Separate device PU with high-level WHIRL DO_LOOP nests for selected tile, cooperative load, compute, and epilogue loops; explicit edge IF predicates; typed global/shared/local storage and alias facts; synchronization dependencies</w:t>
+            </w:r>
+          </w:p>
+        </w:tc>
+        <w:tc>
+          <w:tcPr>
+            <w:tcW w:type="dxa" w:w="3389"/>
+          </w:tcPr>
+          <w:p>
+            <w:r>
+              <w:rPr>
+                <w:sz w:val="17"/>
+              </w:rPr>
+              <w:t>WHIRL rewriter; link every loop and memory operation to selected plan ID and input source location</w:t>
+            </w:r>
+          </w:p>
+        </w:tc>
+      </w:tr>
+      <w:tr>
+        <w:trPr>
+          <w:cantSplit/>
+        </w:trPr>
+        <w:tc>
+          <w:tcPr>
+            <w:tcW w:type="dxa" w:w="3389"/>
+          </w:tcPr>
+          <w:p>
+            <w:r>
+              <w:rPr>
+                <w:sz w:val="17"/>
+              </w:rPr>
+              <w:t>Host integration</w:t>
+            </w:r>
+          </w:p>
+        </w:tc>
+        <w:tc>
+          <w:tcPr>
+            <w:tcW w:type="dxa" w:w="3389"/>
+          </w:tcPr>
+          <w:p>
+            <w:r>
+              <w:rPr>
+                <w:sz w:val="17"/>
+              </w:rPr>
+              <w:t>Launch/provider operation, arguments, grid/block configuration, selected variant identity, and fallback</w:t>
+            </w:r>
+          </w:p>
+        </w:tc>
+        <w:tc>
+          <w:tcPr>
+            <w:tcW w:type="dxa" w:w="3389"/>
+          </w:tcPr>
+          <w:p>
+            <w:r>
+              <w:rPr>
+                <w:sz w:val="17"/>
+              </w:rPr>
+              <w:t>Host PU and runtime interface; never confuse this call with the device-kernel body</w:t>
+            </w:r>
+          </w:p>
+        </w:tc>
+      </w:tr>
+      <w:tr>
+        <w:trPr>
+          <w:cantSplit/>
+        </w:trPr>
+        <w:tc>
+          <w:tcPr>
+            <w:tcW w:type="dxa" w:w="3389"/>
+          </w:tcPr>
+          <w:p>
+            <w:r>
+              <w:t>Target lowering and source emission</w:t>
+            </w:r>
+          </w:p>
+        </w:tc>
+        <w:tc>
+          <w:tcPr>
+            <w:tcW w:type="dxa" w:w="3389"/>
+          </w:tcPr>
+          <w:p>
+            <w:r>
+              <w:t>Thread/block coordinates, memory-space address formation, barriers, PTX instructions, async copy/TMA, matrix operations, and launch packaging</w:t>
+            </w:r>
+          </w:p>
+        </w:tc>
+        <w:tc>
+          <w:tcPr>
+            <w:tcW w:type="dxa" w:w="3389"/>
+          </w:tcPr>
+          <w:p>
+            <w:r>
+              <w:t>In the completed path, NVISA/backend and `whirl2c -cuda` consume the same selected device PU. The existing template emitter remains a labeled migration baseline, not the authoritative device definition; target-specific details do not enter common plan IR as hard-coded semantics.</w:t>
+            </w:r>
+          </w:p>
+        </w:tc>
+      </w:tr>
+    </w:tbl>
+    <w:p>
+      <w:pPr/>
+      <w:r>
+        <w:t>`WN_CreateDO` and `WN2C_do_loop` already establish a structured WHIRL loop and C emission route. The NVISA tree already contains thread/block special-register handling, global/shared symbol-space flags and lowering, `INTRN_SYNCHRONIZE` to `bar.sync`, and PTX `.entry` emission. These are concrete reuse points, not proof that the historical NVISA backend supports Hopper or Blackwell. First test the old path with a minimal device PU; extend or replace unsupported instruction paths deliberately.</w:t>
+      </w:r>
+    </w:p>
+    <w:p>
+      <w:r>
+        <w:t>Reuse audit anchors in this tree: `osprey/common/com/wn.cxx` and `osprey/be/whirl2c/wn2c.cxx` for structured loops and source emission; `osprey/common/com/symtab_access.h`, `osprey/be/cg/NVISA/exp_loadstore.cxx`, `osprey/be/cg/NVISA/expand.cxx`, and `osprey/be/cg/NVISA/cgemit_targ.cxx` for memory spaces, execution coordinates, barriers, and PTX entry/variable emission. `osprey/be/lno/NVISA/lnotarget.cxx` provides LNO-to-target opcode/resource hooks, but contains unfinished resource-estimation paths; reuse the interface and validated mappings, not uncalibrated cost values.</w:t>
+      </w:r>
+    </w:p>
+    <w:p>
+      <w:pPr/>
+      <w:r>
+        <w:t>`DO_LOOP` alone does not encode CTA/warp ownership, address spaces, barrier uniformity, async transfer completion, register/SMEM capacity, or tensor-core instruction shape. Keep those as validated annotations and target lowering obligations. Materialize the selected synchronous kernel first; introduce `cp.async`/TMA pipeline operations only after the P8 event, arrival, wait, and buffer-lifetime model is explicit. Preserve a legal synchronous fallback.</w:t>
+      </w:r>
+    </w:p>
+    <w:p>
+      <w:pPr>
+        <w:pStyle w:val="Heading2"/>
+      </w:pPr>
+      <w:r>
+        <w:t>6B.3 Lowering And Verification Sequence</w:t>
+      </w:r>
+    </w:p>
+    <w:p>
+      <w:pPr>
+        <w:ind w:left="360" w:hanging="360"/>
+      </w:pPr>
+      <w:r>
+        <w:t>1. Freeze the selected plan and its cost/legality record; retain baseline and rejected candidates for traceability.</w:t>
+      </w:r>
+    </w:p>
+    <w:p>
+      <w:pPr>
+        <w:ind w:left="360" w:hanging="360"/>
+      </w:pPr>
+      <w:r>
+        <w:t>2. Create a device PU and bind tile axes to `DO_LOOP` indices, bounds, steps, source-line provenance, and plan IDs. Represent K-tile staging, cooperative loads, compute, and epilogue as separate structured regions.</w:t>
+      </w:r>
+    </w:p>
+    <w:p>
+      <w:pPr>
+        <w:ind w:left="360" w:hanging="360"/>
+      </w:pPr>
+      <w:r>
+        <w:t>3. Attach global/shared/local storage symbols, tile-range alias and ownership facts, edge predicates, barriers, and buffer lifetimes. Check bounds, absence of unsafe overlap, resource limits, and barrier convergence before target lowering.</w:t>
+      </w:r>
+    </w:p>
+    <w:p>
+      <w:pPr>
+        <w:ind w:left="360" w:hanging="360"/>
+      </w:pPr>
+      <w:r>
+        <w:t>4. Run `whirl2c -cuda` on the selected high-level device PU to derive `.cu` for the present remote-validation workflow. Independently lower that same PU through NVISA/PTX where the target feature is supported. Do not maintain an unrelated string-template kernel as the authoritative implementation after this milestone.</w:t>
+      </w:r>
+    </w:p>
+    <w:p>
+      <w:pPr>
+        <w:ind w:left="360" w:hanging="360"/>
+      </w:pPr>
+      <w:r>
+        <w:t>5. Verify a before/after WHIRL dump contains the complete `DO_LOOP` nest, memory operations, and synchronization in the device PU; check the emitted `.cu` against that PU and selected plan; run numerical and GPU performance validation when hardware is available. A detached loop, a host provider call, or a matching source comment by itself fails this milestone.</w:t>
+      </w:r>
+    </w:p>
+    <w:p>
+      <w:pPr/>
+      <w:r>
+        <w:t>AI-P9 tracing must name the device PU, selected plan, loop IDs/bounds, global and shared buffers, barrier sites, source line, target path, verification status, and actual rewrite outcome. The analyzer's `physical-plan.log` and `optimization-summary.log` must distinguish `plan_selected`, `host_dispatch_rewritten`, `device_pu_materialized`, and `device_target_lowered`; no one event implies the next.</w:t>
+      </w:r>
+    </w:p>
+    <w:p>
+      <w:pPr>
+        <w:pStyle w:val="Heading2"/>
+      </w:pPr>
+      <w:r>
+        <w:t>6B.4 Comparative Evaluation Gate</w:t>
+      </w:r>
+    </w:p>
+    <w:p>
+      <w:pPr/>
+      <w:r>
+        <w:t>Compare equivalent GEMM shapes, dtypes, layouts, numerical tolerances, launch conditions, and hardware in distinct lanes: (1) nvcc/NVVM compiling comparable CUDA, (2) Clang CUDA as a separate LLVM implementation, and (3) CUTLASS and Triton as library/kernel-system baselines rather than synonyms for nvcc. Report correctness, kernel latency and throughput, HBM/SMEM/register traffic or proxies, occupancy, bank conflicts, compile time, and generated PTX/SASS when available. Measure both the structured-WHIRL path and the existing source-emission baseline. Claim superiority only for demonstrated workloads and metrics; where NVIDIA proprietary compiler internals are unavailable, compare observable outputs rather than inventing pipeline details. Section 12 separates NVIDIA's nvcc/NVVM evidence from LLVM and MLIR documentation.</w:t>
+      </w:r>
+    </w:p>
+    <w:p>
+      <w:pPr>
+        <w:pStyle w:val="Heading2"/>
+      </w:pPr>
+      <w:r>
+        <w:t>6B.5 CUDA C Derived From WHIRL</w:t>
+      </w:r>
+    </w:p>
+    <w:p>
+      <w:pPr/>
+      <w:r/>
+      <w:r>
+        <w:rPr>
+          <w:b/>
+        </w:rPr>
+        <w:t>Accepted DSC design decision, not a claim about the current implementation.</w:t>
+      </w:r>
+      <w:r>
+        <w:t xml:space="preserve"> In the completed path, the selected device PU is the single executable kernel definition. `whirl2c -cuda` is a proposed opt-in mode of the existing standalone translator; it reads selected high-level WHIRL and emits CUDA C from that PU. The existing C mode retains its behavior. The intended command shape is `whirl2c -cuda -CLIST:dotc_file=&lt;output.cu&gt; &lt;selected-whirl.B&gt;`; the option spelling and output-file integration must be implemented and tested, not assumed to exist today. The in-process source-emission path should use the same translation mode. Emit before lowerings that destroy structured loops or memory-space intent.</w:t>
+      </w:r>
+    </w:p>
+    <w:p>
+      <w:pPr/>
+      <w:r/>
+      <w:r>
+        <w:rPr>
+          <w:b/>
+        </w:rPr>
+        <w:t>Migration baseline.</w:t>
+      </w:r>
+      <w:r>
+        <w:t xml:space="preserve"> Preserve the existing source-template emitter under a proposed `-Wb,-DSL:cuda_legacy_emit=ON` control, defaulting to ON during development. A `.cu` file remains requested separately by the existing `-Wb,-DSL:cuda_tile_output=&lt;new-file.cu&gt;` option; ordinary compilations must not gain an unsolicited sidecar. When implemented, `cuda_legacy_emit=OFF` must suppress legacy source even if an output path was supplied, and the current `cuda_tile_apply=ON` path must require legacy emission until device-PU lowering replaces it. Phase coverage must record `cuda_legacy_emit_off` rather than claiming a selected tile when this disables the current source path. Keep this emitter available after `whirl2c -cuda` first works so equivalent plans can be compared, but never label legacy source as WHIRL-derived.</w:t>
+      </w:r>
+    </w:p>
+    <w:p>
+      <w:pPr>
+        <w:keepLines/>
+      </w:pPr>
+      <w:r>
+        <w:t>The CUDA mode must translate the full synchronous GEMM body: device entry and parameters, CTA/thread coordinates, selected `DO_LOOP` nests, edge predicates, global-memory addresses, shared-memory A/B buffers, cooperative loads, barriers, register accumulators, FMA/compute loops, and stores. It must obtain type, shape, address space, ownership, and layout from verified WHIRL symbols/operations and selected-plan bindings. A host launch wrapper is a distinct artifact that consumes the same plan ID, grid/block dimensions, arguments, and guards; it is not a second definition of device behavior. Existing `WN2C_do_loop` supplies generic loop emission, but CUDA qualifiers, GPU builtins, memory spaces, barriers, and later TMA need explicit CUDA-mode handling.</w:t>
+      </w:r>
+    </w:p>
+    <w:p>
+      <w:pPr/>
+      <w:r>
+        <w:t>The first `whirl2c -cuda` implementation accepts only the synchronous F32 matmul subset and fails closed on an unsupported device operator, memory-space annotation, intrinsic, or barrier contract. It must not fill a gap by splicing in a handwritten CUDA kernel body. P8 may add `cp.async` or TMA only after transfer, buffer lifetime, barrier arrival/wait, and fallback semantics exist in WHIRL and have a tested CUDA translation. New target operations must use compatible existing WHIRL mechanisms where possible; binary WHIRL format changes require an explicit versioned contract.</w:t>
+      </w:r>
+    </w:p>
+    <w:p>
+      <w:pPr/>
+      <w:r>
+        <w:t>Driver-owned program-level code creates and registers the device PU after whole-plan legality and profitability selection; the per-PU VHO pass must not silently fabricate a second PU. The same verified PU can feed `whirl2c -cuda` and, for supported features, NVISA/PTX lowering. Retain two separate, immutable review lanes for an equivalent selected plan: legacy `.cu` plus its `.t` trace and receipt, and WHIRL-derived `.cu` plus the saved device `.B`, translation trace, and receipt. Compare loop bounds, memory spaces, buffer sizes, barrier/transfer order, launch geometry, numerical output, and target performance; source text need not match byte-for-byte. The selected-plan trace and artifact receipt must identify the device PU when present, `.B` hash, source hash, emitter mode, translated loop/buffer/barrier counts, unsupported-feature result, and host launch binding. Accept the WHIRL-derived vertical slice only when the saved device WHIRL contains the complete synchronous kernel, its generated `.cu` compiles, its numerical result matches the baseline, and trace-to-source checks establish that no executable kernel behavior came from a parallel template. GPU timing remains a separate performance gate.</w:t>
+      </w:r>
+    </w:p>
+    <w:p>
+      <w:pPr>
+        <w:pStyle w:val="Heading1"/>
+      </w:pPr>
+      <w:r>
         <w:t>7 Candidate Generation And Profitability Architecture</w:t>
       </w:r>
     </w:p>
@@ -9513,7 +9947,7 @@
         <w:spacing w:after="60"/>
       </w:pPr>
       <w:r>
-        <w:t>Priority 2: First real tiling path. Select one canonical GEMM, convolution, or matmul-like loop/tensor region. Detect it, generate at least two tile candidates plus baseline, estimate memory traffic and resource pressure, rewrite the loop or kernel, and measure. Acceptance gate: transformed IR is visibly tiled and either improves performance or records a cost-model miss.</w:t>
+        <w:t>Priority 2: First real tiling path. Select one canonical GEMM, convolution, or matmul-like loop/tensor region. Detect it, generate at least two tile candidates plus baseline, estimate memory traffic and resource pressure, rewrite the loop or kernel, and measure. Acceptance gate: the selected device PU contains visible high-level WHIRL tile loops, and either improves performance or records a cost-model miss. A tiled `.cu` sidecar alone is an intermediate milestone.</w:t>
       </w:r>
     </w:p>
     <w:p>
@@ -9646,6 +10080,11 @@
       </w:pPr>
       <w:r>
         <w:t>This slice is intentionally smaller than the full design. It proves the compiler can make a choice and act. Once this loop exists, the architecture can grow without remaining purely descriptive.</w:t>
+      </w:r>
+    </w:p>
+    <w:p>
+      <w:r>
+        <w:t>For the current matmul path, the immediate representation step is narrower still: make one selected K-tile loop a verified `DO_LOOP` in a device PU, then move cooperative load, compute, and epilogue loops into that PU without changing the cost gate or trace identity. Only after structural verification should the emitted `.cu` be driven from this PU. The following target milestone reuses NVISA memory-space, thread-index, barrier, and PTX-entry machinery where validated; TMA and modern matrix instruction support require separate target work.</w:t>
       </w:r>
     </w:p>
     <w:p>
@@ -11868,16 +12307,8 @@
             </w:tcBorders>
           </w:tcPr>
           <w:p>
-            <w:pPr>
-              <w:spacing w:after="0"/>
-            </w:pPr>
-            <w:r/>
-            <w:r>
-              <w:rPr>
-                <w:b w:val="0"/>
-                <w:sz w:val="15"/>
-              </w:rPr>
-              <w:t>Whole-plan composition, rejected alternatives, fusion boundary, launches and syncs, selected cost, IR changes, and structural verification.</w:t>
+            <w:r>
+              <w:t>Final whole-plan composition, rejected alternatives, fusion boundary, launches and syncs, selected cost, host versus device PU changes, structured loop IDs, memory-space and barrier facts, target path, and structural verification.</w:t>
             </w:r>
           </w:p>
         </w:tc>
@@ -11896,16 +12327,8 @@
             </w:tcBorders>
           </w:tcPr>
           <w:p>
-            <w:pPr>
-              <w:spacing w:after="0"/>
-            </w:pPr>
-            <w:r/>
-            <w:r>
-              <w:rPr>
-                <w:b w:val="0"/>
-                <w:sz w:val="15"/>
-              </w:rPr>
-              <w:t>Stable plan id, SELECT, REWRITE, verification record.</w:t>
+            <w:r>
+              <w:t>Stable plan identity, SELECT, REWRITE, and a verification record; device-PU loop materialization and target lowering remain incomplete.</w:t>
             </w:r>
           </w:p>
         </w:tc>
@@ -13799,10 +14222,63 @@
     </w:p>
     <w:p>
       <w:pPr>
+        <w:pStyle w:val="Heading2"/>
+      </w:pPr>
+      <w:r>
+        <w:t>11.9 WHIRL device PU and NVISA modernization</w:t>
+      </w:r>
+    </w:p>
+    <w:p>
+      <w:r>
+        <w:t>Specify the selected-plan-to-`DO_LOOP` schema, plan/source provenance, GPU execution mapping, barrier and alias legality checks, memory-space symbols, `whirl2c -cuda` option and fail-closed source-emitter contract, the default-on legacy baseline switch, and rollback behavior. Audit NVISA by feature and architecture rather than assuming present-day GPU support: PTX version, 64-bit addressing, warp/CTA mapping, shared-memory layout and banks, `cp.async`, TMA/mbarrier, WGMMA/TMEM, low-precision formats, and launch packaging. Record each feature as reused, extended, replaced, or unsupported with a test and target GPU. Define comparable nvcc/NVVM measurements first; keep Clang CUDA and MLIR/Triton comparisons separate before claiming a compiler advantage.</w:t>
+      </w:r>
+    </w:p>
+    <w:p>
+      <w:pPr>
         <w:pStyle w:val="Heading1"/>
       </w:pPr>
       <w:r>
         <w:t>12 Reference Notes</w:t>
+      </w:r>
+    </w:p>
+    <w:p>
+      <w:pPr>
+        <w:pStyle w:val="ListBullet"/>
+      </w:pPr>
+      <w:r>
+        <w:t>NVIDIA, "NVIDIA Opens Up CUDA Platform by Releasing Compiler Source Code," December 13, 2011, https://nvidianews.nvidia.com/news/nvidia-opens-up-cuda-platform-by-releasing-compiler-source-code: dates the LLVM-based CUDA compiler in CUDA Toolkit 4.1, earlier than a 2014 start date.</w:t>
+      </w:r>
+    </w:p>
+    <w:p>
+      <w:pPr>
+        <w:pStyle w:val="ListBullet"/>
+      </w:pPr>
+      <w:r>
+        <w:t>NVIDIA CUDA LLVM Compiler, https://developer.nvidia.com/CUDA-LLVM-Compiler: identifies nvcc as LLVM-based and libNVVM/NVVM IR as the compiler SDK's GPU path.</w:t>
+      </w:r>
+    </w:p>
+    <w:p>
+      <w:pPr>
+        <w:pStyle w:val="ListBullet"/>
+      </w:pPr>
+      <w:r>
+        <w:t>LLVM Language Reference, https://llvm.org/docs/LangRef.html: documents the lower-level basic-block and branch representation used in the Section 6B comparison.</w:t>
+      </w:r>
+    </w:p>
+    <w:p>
+      <w:pPr>
+        <w:pStyle w:val="ListBullet"/>
+      </w:pPr>
+      <w:r>
+        <w:t>MLIR Affine, SCF, and Transform dialect documentation, https://mlir.llvm.org/docs/Dialects/Affine/, https://mlir.llvm.org/docs/Dialects/SCFDialect/, and https://mlir.llvm.org/docs/Dialects/Transform/: a separate structured-IR comparison, not evidence that nvcc is MLIR-based.</w:t>
+      </w:r>
+    </w:p>
+    <w:p>
+      <w:pPr>
+        <w:pStyle w:val="ListBullet"/>
+      </w:pPr>
+      <w:r>
+        <w:t>NVIDIA NVVM IR specification, https://docs.nvidia.com/cuda/nvvm-ir-spec/: documents an LLVM-based GPU IR path, without exposing proprietary nvcc optimization internals. Section 6B therefore treats performance superiority as an empirical question.</w:t>
       </w:r>
     </w:p>
     <w:p>

</xml_diff>

<commit_message>
Document delayed GEMM planning and OpenPy execution modes
</commit_message>
<xml_diff>
--- a/doc/AI_compiler_optimization_design_v0.3.docx
+++ b/doc/AI_compiler_optimization_design_v0.3.docx
@@ -39,7 +39,7 @@
         <w:spacing w:after="120"/>
       </w:pPr>
       <w:r>
-        <w:t>Status: v0.3 adds a phase-by-phase optimization reporting contract and identifies trace fields still needed for a trustworthy cross-phase report. The 2026-10-18 amendment fixes the matmul-first trace, report, and durable-artifact conventions in Section 9.7. The 2026-10-21 amendments add the predicted and measured Roofline contract in Section 7.2A, the high-level WHIRL/NVISA convergence contract in Section 6B, and the accepted `whirl2c -cuda` source-emission direction in Section 6B.5. The design retains the existing `.cu` emitter as a migration baseline and specifies a default-on control for it; neither implies that device WHIRL is complete. AIO-9 has a compact WOPT-style selection trace and a tile-phase report; full cross-phase coverage, Roofline reporting, and WHIRL device-loop lowering remain proposals. Research-derived inspiration and DSC design proposals remain distinct.</w:t>
+        <w:t>Status: v0.3 adds a phase-by-phase optimization reporting contract and identifies trace fields still needed for a trustworthy cross-phase report. The 2026-10-18 amendment fixes the matmul-first trace, report, and durable-artifact conventions in Section 9.7. The 2026-10-21 amendments add the predicted and measured Roofline contract in Section 7.2A, the high-level WHIRL/NVISA convergence contract in Section 6B, and the accepted `whirl2c -cuda` source-emission direction in Section 6B.5. The 2026-10-22 amendment makes SMEM cache-blocking a costed alternative within an opt-in delayed joint-plan search (Section 6A.3B), with the rationale preserved in a separate white-paper candidate. The design retains the existing `.cu` emitter as a migration baseline and specifies a default-on control for it; neither implies that device WHIRL is complete. AIO-9 has a compact WOPT-style selection trace and a tile-phase report; full cross-phase coverage, Roofline reporting, and WHIRL device-loop lowering remain proposals. Research-derived inspiration and DSC design proposals remain distinct.</w:t>
       </w:r>
     </w:p>
     <w:p>
@@ -2832,7 +2832,11 @@
             <w:pPr>
               <w:spacing w:after="0"/>
             </w:pPr>
-            <w:r/>
+            <w:r>
+              <w:rPr>
+                <w:sz w:val="15"/>
+              </w:rPr>
+            </w:r>
             <w:r>
               <w:rPr>
                 <w:b w:val="0"/>
@@ -2857,16 +2861,11 @@
             </w:tcBorders>
           </w:tcPr>
           <w:p>
-            <w:pPr>
-              <w:spacing w:after="0"/>
-            </w:pPr>
-            <w:r/>
-            <w:r>
-              <w:rPr>
-                <w:b w:val="0"/>
+            <w:r>
+              <w:rPr>
                 <w:sz w:val="15"/>
               </w:rPr>
-              <w:t>Reusable layout names, strides, blocking, packing, swizzle, and alignment constraints.</w:t>
+              <w:t>Persistent storage representation (shape, strides, packing, alignment) separate from transient SMEM/register layouts. A GMEM repack creates a costed representation edge; a lane remap does not.</w:t>
             </w:r>
           </w:p>
         </w:tc>
@@ -3094,7 +3093,11 @@
             <w:pPr>
               <w:spacing w:after="0"/>
             </w:pPr>
-            <w:r/>
+            <w:r>
+              <w:rPr>
+                <w:sz w:val="15"/>
+              </w:rPr>
+            </w:r>
             <w:r>
               <w:rPr>
                 <w:b w:val="0"/>
@@ -3118,16 +3121,11 @@
             </w:tcBorders>
           </w:tcPr>
           <w:p>
-            <w:pPr>
-              <w:spacing w:after="0"/>
-            </w:pPr>
-            <w:r/>
-            <w:r>
-              <w:rPr>
-                <w:b w:val="0"/>
+            <w:r>
+              <w:rPr>
                 <w:sz w:val="15"/>
               </w:rPr>
-              <w:t>Sequential, tiled, strided, gather, scatter, reuse distance, producer-consumer timing.</w:t>
+              <w:t>Per-memory-operation lane/warp-to-address map, active mask, vector width, alignment, requested sectors, useful bytes, reuse, and timing. Access mapping is not persistent storage layout.</w:t>
             </w:r>
           </w:p>
         </w:tc>
@@ -5585,7 +5583,11 @@
             <w:pPr>
               <w:spacing w:after="0"/>
             </w:pPr>
-            <w:r/>
+            <w:r>
+              <w:rPr>
+                <w:sz w:val="15"/>
+              </w:rPr>
+            </w:r>
             <w:r>
               <w:rPr>
                 <w:b w:val="0"/>
@@ -5610,16 +5612,11 @@
             </w:tcBorders>
           </w:tcPr>
           <w:p>
-            <w:pPr>
-              <w:spacing w:after="0"/>
-            </w:pPr>
-            <w:r/>
-            <w:r>
-              <w:rPr>
-                <w:b w:val="0"/>
+            <w:r>
+              <w:rPr>
                 <w:sz w:val="15"/>
               </w:rPr>
-              <w:t>Logical layout alternatives</w:t>
+              <w:t>Logical alternatives; preserve the existing persistent GMEM representation.</w:t>
             </w:r>
           </w:p>
         </w:tc>
@@ -5844,16 +5841,11 @@
             </w:tcBorders>
           </w:tcPr>
           <w:p>
-            <w:pPr>
-              <w:spacing w:after="0"/>
-            </w:pPr>
-            <w:r/>
-            <w:r>
-              <w:rPr>
-                <w:b w:val="0"/>
+            <w:r>
+              <w:rPr>
                 <w:sz w:val="15"/>
               </w:rPr>
-              <w:t>CommonMemoryResidencyIR, MemoryHierarchyDescriptorIR</w:t>
+              <w:t>CommonMemoryResidencyIR, CommonLayoutIR, MemoryHierarchyDescriptorIR</w:t>
             </w:r>
           </w:p>
         </w:tc>
@@ -5871,16 +5863,11 @@
             </w:tcBorders>
           </w:tcPr>
           <w:p>
-            <w:pPr>
-              <w:spacing w:after="0"/>
-            </w:pPr>
-            <w:r/>
-            <w:r>
-              <w:rPr>
-                <w:b w:val="0"/>
+            <w:r>
+              <w:rPr>
                 <w:sz w:val="15"/>
               </w:rPr>
-              <w:t>HBM, L2, shared, registers, CPU, remote memory</w:t>
+              <w:t>Existing GMEM storage, optional costed repack alternatives, HBM/L2/SMEM/register residency.</w:t>
             </w:r>
           </w:p>
         </w:tc>
@@ -5935,7 +5922,11 @@
             <w:pPr>
               <w:spacing w:after="0"/>
             </w:pPr>
-            <w:r/>
+            <w:r>
+              <w:rPr>
+                <w:sz w:val="15"/>
+              </w:rPr>
+            </w:r>
             <w:r>
               <w:rPr>
                 <w:b w:val="0"/>
@@ -5960,16 +5951,11 @@
             </w:tcBorders>
           </w:tcPr>
           <w:p>
-            <w:pPr>
-              <w:spacing w:after="0"/>
-            </w:pPr>
-            <w:r/>
-            <w:r>
-              <w:rPr>
-                <w:b w:val="0"/>
+            <w:r>
+              <w:rPr>
                 <w:sz w:val="15"/>
               </w:rPr>
-              <w:t>Output/reduction/CTA/SMEM/warp/thread/register/vector tile families, coalescing, arithmetic intensity, occupancy, resource pressure</w:t>
+              <w:t>Joint A/B/C access maps and hierarchical tiles; per-operation GMEM transaction utilization, arithmetic intensity, occupancy, and resource pressure.</w:t>
             </w:r>
           </w:p>
         </w:tc>
@@ -6751,16 +6737,11 @@
             </w:tcBorders>
           </w:tcPr>
           <w:p>
-            <w:pPr>
-              <w:spacing w:after="0"/>
-            </w:pPr>
-            <w:r/>
-            <w:r>
-              <w:rPr>
-                <w:b w:val="0"/>
+            <w:r>
+              <w:rPr>
                 <w:sz w:val="14"/>
               </w:rPr>
-              <w:t>Global-memory coalescing tile</w:t>
+              <w:t>GMEM access mapping: remap output ownership and A/B/C warp accesses; repacking is a separate candidate.</w:t>
             </w:r>
           </w:p>
         </w:tc>
@@ -6778,16 +6759,11 @@
             </w:tcBorders>
           </w:tcPr>
           <w:p>
-            <w:pPr>
-              <w:spacing w:after="0"/>
-            </w:pPr>
-            <w:r/>
-            <w:r>
-              <w:rPr>
-                <w:b w:val="0"/>
+            <w:r>
+              <w:rPr>
                 <w:sz w:val="14"/>
               </w:rPr>
-              <w:t>Kernel 2 GMEM coalescing.</w:t>
+              <w:t>Kernel 2 remaps threads without changing A/B storage.</w:t>
             </w:r>
           </w:p>
         </w:tc>
@@ -6805,16 +6781,11 @@
             </w:tcBorders>
           </w:tcPr>
           <w:p>
-            <w:pPr>
-              <w:spacing w:after="0"/>
-            </w:pPr>
-            <w:r/>
-            <w:r>
-              <w:rPr>
-                <w:b w:val="0"/>
+            <w:r>
+              <w:rPr>
                 <w:sz w:val="14"/>
               </w:rPr>
-              <w:t>lane_to_address_map; coalescing_width; alignment_assumption; transaction_width.</w:t>
+              <w:t>per_op_lane_to_address_map; active_mask; requested_sectors; useful_bytes; representation_id; optional repack_edge.</w:t>
             </w:r>
           </w:p>
         </w:tc>
@@ -6981,16 +6952,8 @@
             </w:tcBorders>
           </w:tcPr>
           <w:p>
-            <w:pPr>
-              <w:spacing w:after="0"/>
-            </w:pPr>
-            <w:r/>
-            <w:r>
-              <w:rPr>
-                <w:b w:val="0"/>
-                <w:sz w:val="14"/>
-              </w:rPr>
-              <w:t>Shared-memory tile and prefetch hint</w:t>
+            <w:r>
+              <w:t>Shared-memory cache-blocking alternatives</w:t>
             </w:r>
           </w:p>
         </w:tc>
@@ -7008,16 +6971,8 @@
             </w:tcBorders>
           </w:tcPr>
           <w:p>
-            <w:pPr>
-              <w:spacing w:after="0"/>
-            </w:pPr>
-            <w:r/>
-            <w:r>
-              <w:rPr>
-                <w:b w:val="0"/>
-                <w:sz w:val="14"/>
-              </w:rPr>
-              <w:t>Kernel 3 shared-memory cache blocking; later TMA/cp.async pipeline realization.</w:t>
+            <w:r>
+              <w:t>Keep direct/cache-served A/B access; propose one-slot sync and legal multi-slot SMEM plans with distinct A/B copy maps, layouts, reuse, and P8 hints. No residency decision yet.</w:t>
             </w:r>
           </w:p>
         </w:tc>
@@ -7035,16 +6990,8 @@
             </w:tcBorders>
           </w:tcPr>
           <w:p>
-            <w:pPr>
-              <w:spacing w:after="0"/>
-            </w:pPr>
-            <w:r/>
-            <w:r>
-              <w:rPr>
-                <w:b w:val="0"/>
-                <w:sz w:val="14"/>
-              </w:rPr>
-              <w:t>smem_layout; smem_tile_shape; reuse_distance; tma_legality; buffering_feasibility; synchronization_points.</w:t>
+            <w:r>
+              <w:t>CommonMemoryResidencyIR; A/B smem_layout; CommonTilePlanIR smem_tile_shape, copy_map, stage_footprint, reuse; P8 hints.</w:t>
             </w:r>
           </w:p>
         </w:tc>
@@ -7949,10 +7896,25 @@
     <w:p>
       <w:pPr>
         <w:pStyle w:val="ListBullet"/>
-        <w:spacing w:after="60"/>
-      </w:pPr>
-      <w:r>
-        <w:t>layout_transform: transposed SMEM layout, swizzle, padding, or bank-conflict avoidance transform.</w:t>
+      </w:pPr>
+      <w:r>
+        <w:t>residency_alternatives: direct/cache-served GMEM, one-slot synchronous SMEM, and target-legal multi-slot SMEM; each binds separate A/B copy maps, SMEM layouts, consumer maps, and resource ledgers.</w:t>
+      </w:r>
+    </w:p>
+    <w:p>
+      <w:pPr>
+        <w:pStyle w:val="ListBullet"/>
+      </w:pPr>
+      <w:r>
+        <w:t>persistent_gmem_representation: existing A/B/C storage identity, strides, packing, and alignment; optional repacked representation and conversion edge.</w:t>
+      </w:r>
+    </w:p>
+    <w:p>
+      <w:pPr>
+        <w:pStyle w:val="ListBullet"/>
+      </w:pPr>
+      <w:r>
+        <w:t>access_layout: per-operation lane/warp-to-element mapping for A loads, B loads, and C stores, separate from storage and SMEM/register layout.</w:t>
       </w:r>
     </w:p>
     <w:p>
@@ -7961,7 +7923,7 @@
         <w:spacing w:after="60"/>
       </w:pPr>
       <w:r>
-        <w:t>low_precision_format: dtype family such as BF16, FP8, MXFP8, MXFP4, NVFP4, accumulation dtype, packing alignment, and supported Tensor Core instruction family.</w:t>
+        <w:t>layout_transform: transposed SMEM layout, swizzle, padding, or bank-conflict avoidance; charge conversions between access, staging, and compute layouts.</w:t>
       </w:r>
     </w:p>
     <w:p>
@@ -7970,7 +7932,7 @@
         <w:spacing w:after="60"/>
       </w:pPr>
       <w:r>
-        <w:t>scale_tile_shape: scale-factor tensor tile shape, scale granularity, scale reuse scope, and scale layout compatibility when the value format uses block or micro-tensor scaling.</w:t>
+        <w:t>low_precision_format: dtype family such as BF16, FP8, MXFP8, MXFP4, NVFP4, accumulation dtype, packing alignment, and supported Tensor Core instruction family.</w:t>
       </w:r>
     </w:p>
     <w:p>
@@ -7979,7 +7941,7 @@
         <w:spacing w:after="60"/>
       </w:pPr>
       <w:r>
-        <w:t>effective_tile_bytes: packed value bytes plus scale metadata bytes, layout padding, alignment padding, and conversion or repacking traffic.</w:t>
+        <w:t>scale_tile_shape: scale-factor tensor tile shape, scale granularity, scale reuse scope, and scale layout compatibility when the value format uses block or micro-tensor scaling.</w:t>
       </w:r>
     </w:p>
     <w:p>
@@ -7988,7 +7950,7 @@
         <w:spacing w:after="60"/>
       </w:pPr>
       <w:r>
-        <w:t>smem_prefetch_hint: producer-consumer distance, reuse distance, expected stage count, and whether TMA, cp.async, vectorized LDG, or scalar fallback should be evaluated.</w:t>
+        <w:t>effective_tile_bytes: packed value bytes plus scale metadata bytes, layout padding, alignment padding, and conversion or repacking traffic.</w:t>
       </w:r>
     </w:p>
     <w:p>
@@ -7997,7 +7959,7 @@
         <w:spacing w:after="60"/>
       </w:pPr>
       <w:r>
-        <w:t>tma_legality: affine source range, rectangular or regularly strided tile, compatible destination layout, required alignment, boundary handling, and alias-safety conditions.</w:t>
+        <w:t>smem_prefetch_hint: producer-consumer distance, reuse distance, expected stage count, and whether TMA, cp.async, vectorized LDG, or scalar fallback should be evaluated.</w:t>
       </w:r>
     </w:p>
     <w:p>
@@ -8006,7 +7968,7 @@
         <w:spacing w:after="60"/>
       </w:pPr>
       <w:r>
-        <w:t>buffering_feasibility: one-stage, two-stage, or N-stage buffering feasibility under SMEM, register, CTA, and occupancy limits.</w:t>
+        <w:t>tma_legality: affine source range, rectangular or regularly strided tile, compatible destination layout, required alignment, boundary handling, and alias-safety conditions.</w:t>
       </w:r>
     </w:p>
     <w:p>
@@ -8015,7 +7977,7 @@
         <w:spacing w:after="60"/>
       </w:pPr>
       <w:r>
-        <w:t>access_vectorization: scalar, float2, float4, LDG/STG width, LDS width, alignment requirement.</w:t>
+        <w:t>buffering_feasibility: one-stage, two-stage, or N-stage buffering feasibility under SMEM, register, CTA, and occupancy limits.</w:t>
       </w:r>
     </w:p>
     <w:p>
@@ -8024,7 +7986,7 @@
         <w:spacing w:after="60"/>
       </w:pPr>
       <w:r>
-        <w:t>coalescing_model: lane-to-address mapping, transaction width, contiguous-lane count, wasted transaction estimate.</w:t>
+        <w:t>access_vectorization: scalar, float2, float4, LDG/STG width, LDS width, alignment requirement.</w:t>
       </w:r>
     </w:p>
     <w:p>
@@ -8033,7 +7995,7 @@
         <w:spacing w:after="60"/>
       </w:pPr>
       <w:r>
-        <w:t>occupancy_model_inputs: registers/thread, SMEM/CTA, CTAs/SM, warps/SM, launch grid, wave quantization.</w:t>
+        <w:t>coalescing_model: per warp memory instruction, active lanes, addressed bytes, target-profile sectors, useful bytes, utilization, and cache assumptions. Keep GMEM request bytes distinct from estimated HBM bytes.</w:t>
       </w:r>
     </w:p>
     <w:p>
@@ -8042,7 +8004,7 @@
         <w:spacing w:after="60"/>
       </w:pPr>
       <w:r>
-        <w:t>synchronization_model: barriers needed for SMEM tile population, SMEM reuse, and tile overwrite safety.</w:t>
+        <w:t>occupancy_model_inputs: registers/thread, SMEM/CTA, CTAs/SM, warps/SM, launch grid, wave quantization.</w:t>
       </w:r>
     </w:p>
     <w:p>
@@ -8051,7 +8013,7 @@
         <w:spacing w:after="60"/>
       </w:pPr>
       <w:r>
-        <w:t>arithmetic_intensity_model: FLOPs per GMEM byte, FLOPs per SMEM byte, reuse factors by tile level.</w:t>
+        <w:t>synchronization_model: barriers needed for SMEM tile population, SMEM reuse, and tile overwrite safety.</w:t>
       </w:r>
     </w:p>
     <w:p>
@@ -8060,7 +8022,7 @@
         <w:spacing w:after="60"/>
       </w:pPr>
       <w:r>
-        <w:t>autotune_dimensions: tunable symbols such as BM, BN, BK, TM, TN, warp tile shape, vector width, stages.</w:t>
+        <w:t>arithmetic_intensity_model: FLOPs per GMEM byte, FLOPs per SMEM byte, reuse factors by tile level.</w:t>
       </w:r>
     </w:p>
     <w:p>
@@ -8069,23 +8031,7 @@
         <w:spacing w:after="60"/>
       </w:pPr>
       <w:r>
-        <w:t>legality_guards: divisibility, bounds masking, pointer alignment, dtype alignment, layout compatibility.</w:t>
-      </w:r>
-    </w:p>
-    <w:p>
-      <w:pPr>
-        <w:pStyle w:val="Heading2"/>
-      </w:pPr>
-      <w:r>
-        <w:t>6A.3 Mapping To Later Phases</w:t>
-      </w:r>
-    </w:p>
-    <w:p>
-      <w:pPr>
-        <w:spacing w:after="120"/>
-      </w:pPr>
-      <w:r>
-        <w:t>P7 creates the tile candidates, but later phases still decide whether and how to use them.</w:t>
+        <w:t>autotune_dimensions: tunable symbols such as BM, BN, BK, TM, TN, warp tile shape, vector width, stages.</w:t>
       </w:r>
     </w:p>
     <w:p>
@@ -8094,7 +8040,23 @@
         <w:spacing w:after="60"/>
       </w:pPr>
       <w:r>
-        <w:t>AI-P8 consumes P7 tile shapes to build fetch, prefetch, double-buffering, cp.async/TMA, and SMEM-to-register pipeline plans.</w:t>
+        <w:t>legality_guards: divisibility, bounds masking, pointer alignment, dtype alignment, layout compatibility.</w:t>
+      </w:r>
+    </w:p>
+    <w:p>
+      <w:pPr>
+        <w:pStyle w:val="Heading2"/>
+      </w:pPr>
+      <w:r>
+        <w:t>6A.3 Mapping To Later Phases</w:t>
+      </w:r>
+    </w:p>
+    <w:p>
+      <w:pPr>
+        <w:spacing w:after="120"/>
+      </w:pPr>
+      <w:r>
+        <w:t>P7 creates the tile candidates, but later phases still decide whether and how to use them.</w:t>
       </w:r>
     </w:p>
     <w:p>
@@ -8103,7 +8065,7 @@
         <w:spacing w:after="60"/>
       </w:pPr>
       <w:r>
-        <w:t>AI-P9 consumes P7 tile shapes to choose final loop order, synchronization placement, warp scheduling, instruction shape, and physical kernel realization.</w:t>
+        <w:t>AI-P8 consumes P7 tile shapes to build fetch, prefetch, double-buffering, cp.async/TMA, and SMEM-to-register pipeline plans.</w:t>
       </w:r>
     </w:p>
     <w:p>
@@ -8112,7 +8074,7 @@
         <w:spacing w:after="60"/>
       </w:pPr>
       <w:r>
-        <w:t>AI-P10 consumes P7 autotune dimensions and legality guards to build runtime variants keyed by hardware, shape, dtype, alignment, and measured performance.</w:t>
+        <w:t>AI-P9 consumes P7 tile shapes to choose final loop order, synchronization placement, warp scheduling, instruction shape, and physical kernel realization.</w:t>
       </w:r>
     </w:p>
     <w:p>
@@ -8121,39 +8083,7 @@
         <w:spacing w:after="60"/>
       </w:pPr>
       <w:r>
-        <w:t>AI-P11 feeds measured occupancy, memory transactions, bank conflicts, achieved FLOPs, and guard hit rates back into CandidateCostIR.</w:t>
-      </w:r>
-    </w:p>
-    <w:p>
-      <w:pPr>
-        <w:spacing w:after="120"/>
-      </w:pPr>
-      <w:r>
-        <w:t>The design lesson from CUDA MMM is that every tiling decision is entangled with memory layout, access pattern, residency, and scheduling. Therefore AI-P7 should create rich CommonTilePlanIR alternatives and defer final selection until cost-model and runtime-variant information are available.</w:t>
-      </w:r>
-    </w:p>
-    <w:p>
-      <w:pPr>
-        <w:pStyle w:val="Heading2"/>
-      </w:pPr>
-      <w:r>
-        <w:t>6A.4 P7.4 To P8 Prefetch Hint Contract</w:t>
-      </w:r>
-    </w:p>
-    <w:p>
-      <w:pPr>
-        <w:spacing w:after="120"/>
-      </w:pPr>
-      <w:r>
-        <w:t>P7.4 should not generate the async copy schedule directly. Its responsibility is to preserve enough tile structure for P8 to decide whether a TMA, cp.async, vectorized-load, or scalar fallback movement plan can hide memory latency. This is the same delayed-transformation principle as the rest of the design: P7.4 describes what is worth staging in shared memory; P8 decides how early and by which hardware engine it should be moved.</w:t>
-      </w:r>
-    </w:p>
-    <w:p>
-      <w:pPr>
-        <w:spacing w:after="120"/>
-      </w:pPr>
-      <w:r>
-        <w:t>For each shared-memory tile candidate, P7.4 should emit:</w:t>
+        <w:t>AI-P10 consumes P7 autotune dimensions and legality guards to build runtime variants keyed by hardware, shape, dtype, alignment, and measured performance.</w:t>
       </w:r>
     </w:p>
     <w:p>
@@ -8162,7 +8092,155 @@
         <w:spacing w:after="60"/>
       </w:pPr>
       <w:r>
-        <w:t>smem_tile_shape: A and B tile dimensions, bytes per stage, and edge-tile policy.</w:t>
+        <w:t>AI-P11 feeds measured occupancy, memory transactions, bank conflicts, achieved FLOPs, and guard hit rates back into CandidateCostIR.</w:t>
+      </w:r>
+    </w:p>
+    <w:p>
+      <w:pPr>
+        <w:spacing w:after="120"/>
+      </w:pPr>
+      <w:r>
+        <w:t>The design lesson from CUDA MMM is that every tiling decision is entangled with memory layout, access pattern, residency, and scheduling. Therefore AI-P7 should create rich CommonTilePlanIR alternatives and defer final selection until cost-model and runtime-variant information are available.</w:t>
+      </w:r>
+    </w:p>
+    <w:p>
+      <w:pPr>
+        <w:pStyle w:val="Heading2"/>
+      </w:pPr>
+      <w:r>
+        <w:t>6A.3A GMEM Coalescing Candidate Algorithm</w:t>
+      </w:r>
+    </w:p>
+    <w:p>
+      <w:pPr/>
+      <w:r>
+        <w:t>1. Record existing A/B/C GMEM representations, strides, alignment, alias ranges, and cache assumptions; keep storage unchanged for the default candidate.</w:t>
+      </w:r>
+    </w:p>
+    <w:p>
+      <w:pPr/>
+      <w:r>
+        <w:t>2. Enumerate legal CTA/warp/lane ownership and per-operation access maps with SMEM layouts and compute fragments. Treat physical GMEM repacking as a separate representation candidate with allocation/conversion cost and reuse horizon.</w:t>
+      </w:r>
+    </w:p>
+    <w:p>
+      <w:pPr/>
+      <w:r>
+        <w:t>3. Reject bounds, alias/dependence, unique C-store ownership, alignment, target instruction, or SMEM/register/barrier violations.</w:t>
+      </w:r>
+    </w:p>
+    <w:p>
+      <w:pPr/>
+      <w:r>
+        <w:t>4. For each warp memory instruction, map active lanes to byte addresses and count distinct aligned sectors using target granularity. Report useful distinct bytes divided by requested sector bytes; model cache hits and HBM traffic separately.</w:t>
+      </w:r>
+    </w:p>
+    <w:p>
+      <w:pPr/>
+      <w:r>
+        <w:t>5. Combine A/B/C transaction cost with SMEM banks, conversions, occupancy, P8 movement/overlap, and amortized repack cost. At P9 select the lowest-cost legal complete plan; retain the unchanged baseline and rejection reasons.</w:t>
+      </w:r>
+    </w:p>
+    <w:p>
+      <w:pPr/>
+      <w:r>
+        <w:t>Trace gmem_representation_id, access_map_id, and repack_plan_id (or -), plus per-operation requested sectors, useful bytes, cache assumption, conversion/repack cost, and selection reason. Better coalescing alone does not trigger a source or WHIRL rewrite.</w:t>
+      </w:r>
+    </w:p>
+    <w:p>
+      <w:pPr>
+        <w:pStyle w:val="Heading2"/>
+      </w:pPr>
+      <w:r>
+        <w:t>6A.3B Delayed SMEM Cache-Blocking Selection</w:t>
+      </w:r>
+    </w:p>
+    <w:p>
+      <w:pPr/>
+      <w:r>
+        <w:t>P7.4 proposes rather than promotes A/B SMEM staging. A coalesced direct path may already be served by L1/L2; SMEM can save repeated requests but also adds reads, writes, synchronization, bank effects, and capacity pressure. Boehm's Kernel 3 demonstrates the staged path and two per-K-tile synchronization points; later register tiling shows that SMEM traffic can become a bottleneck. This is research-derived evidence, not an Open64 measurement.</w:t>
+      </w:r>
+    </w:p>
+    <w:p>
+      <w:pPr/>
+      <w:r>
+        <w:t>For each legal BM/BN/BK and warp/thread tile, keep a bounded family: D direct/cache-served A/B loads without A/B SMEM slots; S1 one-slot synchronous A/B staging; SN multi-slot asynchronous staging only where target, movement engine, and buffer lifetime permit it. A and B may have distinct copy maps and SMEM layouts. Keep GMEM representation, A/B lane maps, consumer/register maps, edge policy, and CTA order on the same candidate ID. Physical GMEM repack is a separate costed edge.</w:t>
+      </w:r>
+    </w:p>
+    <w:p>
+      <w:pPr>
+        <w:ind w:left="317" w:hanging="317"/>
+      </w:pPr>
+      <w:r>
+        <w:t>1. Enumerate deterministic bounded tuples; retain D and supported S1 references. Prune only with proved semantic, dependence/alias, alignment, resource, bank-layout, barrier-uniformity, or target constraints; record search bounds and rejection reasons.</w:t>
+      </w:r>
+    </w:p>
+    <w:p>
+      <w:pPr>
+        <w:ind w:left="317" w:hanging="317"/>
+      </w:pPr>
+      <w:r>
+        <w:t>2. Count per-operation warp GMEM requested sectors and useful bytes; estimate L1/L2/HBM traffic under named cache scenarios. For staged paths count SMEM writes/reads, bank conflicts or broadcasts, layout conversions, and padded A/B slot footprints separately.</w:t>
+      </w:r>
+    </w:p>
+    <w:p>
+      <w:pPr>
+        <w:ind w:left="317" w:hanging="317"/>
+      </w:pPr>
+      <w:r>
+        <w:t>3. Send each surviving tuple to P8 for a load/arrival/wait/compute/release event graph. Charge dynamic K-tile barriers, not two barriers for the whole GEMM. Prove that async consumers finish before slot overwrite.</w:t>
+      </w:r>
+    </w:p>
+    <w:p>
+      <w:pPr>
+        <w:ind w:left="317" w:hanging="317"/>
+      </w:pPr>
+      <w:r>
+        <w:t>4. At P9 compare complete legal plans with compute, exposed movement and communication, sync, launch, occupancy/grid waves, and conversion/repack costs. Derive overlap from the event critical path. If uncertainty can reverse the ranking, require a benefit margin or keep the fallback.</w:t>
+      </w:r>
+    </w:p>
+    <w:p>
+      <w:pPr>
+        <w:ind w:left="317" w:hanging="317"/>
+      </w:pPr>
+      <w:r>
+        <w:t>5. Materialize only the selected plan in device WHIRL, reopen and verify it, and report selected versus baseline estimates. Calibrate traffic, stalls, barriers, and runtime when a GPU becomes available; estimates are not measured speedups.</w:t>
+      </w:r>
+    </w:p>
+    <w:p>
+      <w:pPr/>
+      <w:r>
+        <w:t>Experimental control: propose -Wb,-DSL:gemm_plan_search=baseline|joint with baseline as default. Joint enables bounded D/S1/SN whole-plan search. This option is not registered or implemented; until it is, joint must diagnose unsupported mode. It cannot override -O0, cuda_tile_apply, precision permission, target legality, or the conservative fallback. Record mode, budget, target-profile version, lineage, cost provenance, selection reason, and applied WHIRL action in .t and derived reports.</w:t>
+      </w:r>
+    </w:p>
+    <w:p>
+      <w:pPr/>
+      <w:r>
+        <w:t>The architectural hypothesis is that delaying transformation preserves cross-axis plans that sequential one-pass choices may discard. Equal-budget comparisons, prior-art review, and hardware measurement are required before a novelty or performance claim. See AI-COMPILER-WHITE-PAPER-CANDIDATE-DELAYED-GEMM-PLAN-SELECTION.md.</w:t>
+      </w:r>
+    </w:p>
+    <w:p>
+      <w:pPr>
+        <w:pStyle w:val="Heading2"/>
+      </w:pPr>
+      <w:r>
+        <w:t>6A.4 P7.4 To P8 Prefetch Hint Contract</w:t>
+      </w:r>
+    </w:p>
+    <w:p>
+      <w:pPr>
+        <w:spacing w:after="120"/>
+      </w:pPr>
+      <w:r>
+        <w:t>P7.4 does not generate an async copy schedule. It describes direct/cache-served and SMEM-staged alternatives, preserving structure for P8 to test TMA, cp.async, vectorized-load, or scalar movement. P8 may make an S1/SN candidate unprofitable; it does not commit residency.</w:t>
+      </w:r>
+    </w:p>
+    <w:p>
+      <w:pPr>
+        <w:spacing w:after="120"/>
+      </w:pPr>
+      <w:r>
+        <w:t>For each shared-memory tile candidate, P7.4 should emit:</w:t>
       </w:r>
     </w:p>
     <w:p>
@@ -8171,7 +8249,7 @@
         <w:spacing w:after="60"/>
       </w:pPr>
       <w:r>
-        <w:t>smem_layout: canonical, transposed, swizzled, padded, or bank-conflict-avoiding layout.</w:t>
+        <w:t>smem_tile_shape: A and B tile dimensions, bytes per stage, and edge-tile policy.</w:t>
       </w:r>
     </w:p>
     <w:p>
@@ -8180,7 +8258,7 @@
         <w:spacing w:after="60"/>
       </w:pPr>
       <w:r>
-        <w:t>scale_tile_layout: associated scale-factor tile layout and whether it can be staged with, before, or independently from the packed value tile.</w:t>
+        <w:t>smem_layout: canonical, transposed, swizzled, padded, or bank-conflict-avoiding layout.</w:t>
       </w:r>
     </w:p>
     <w:p>
@@ -8189,7 +8267,7 @@
         <w:spacing w:after="60"/>
       </w:pPr>
       <w:r>
-        <w:t>tile_reuse_profile: consumers per staged tile, reuse distance, arithmetic intensity contribution, and expected SMEM-to-register access count.</w:t>
+        <w:t>scale_tile_layout: associated scale-factor tile layout and whether it can be staged with, before, or independently from the packed value tile.</w:t>
       </w:r>
     </w:p>
     <w:p>
@@ -8198,7 +8276,23 @@
         <w:spacing w:after="60"/>
       </w:pPr>
       <w:r>
-        <w:t>prefetch_distance_hint: the candidate number of K-tiles or pipeline stages to fetch ahead.</w:t>
+        <w:t>tile_reuse_profile: consumers per staged tile, reuse distance, arithmetic intensity contribution, and expected SMEM-to-register access count.</w:t>
+      </w:r>
+    </w:p>
+    <w:p>
+      <w:pPr>
+        <w:pStyle w:val="ListBullet"/>
+      </w:pPr>
+      <w:r>
+        <w:t>separate_copy_and_consumer_maps: A/B warp-lane GMEM loads, SMEM store/read maps, requested sectors, bank conflicts or broadcasts, and register-fragment reuse.</w:t>
+      </w:r>
+    </w:p>
+    <w:p>
+      <w:pPr>
+        <w:pStyle w:val="ListBullet"/>
+      </w:pPr>
+      <w:r>
+        <w:t>direct_path_reference: matching non-staged tile, named cache scenario, GMEM transactions, register demand, and no A/B slot or staging barrier.</w:t>
       </w:r>
     </w:p>
     <w:p>
@@ -8207,7 +8301,7 @@
         <w:spacing w:after="60"/>
       </w:pPr>
       <w:r>
-        <w:t>buffering_feasibility: whether one-stage, double-buffered, triple-buffered, or deeper staging fits under SMEM, register, occupancy, and barrier constraints.</w:t>
+        <w:t>prefetch_distance_hint: the candidate number of K-tiles or pipeline stages to fetch ahead.</w:t>
       </w:r>
     </w:p>
     <w:p>
@@ -8216,7 +8310,7 @@
         <w:spacing w:after="60"/>
       </w:pPr>
       <w:r>
-        <w:t>tma_candidate: whether the source and destination form a regular multidimensional transfer suitable for TMA.</w:t>
+        <w:t>buffering_feasibility: whether one-stage, double-buffered, triple-buffered, or deeper staging fits under SMEM, register, occupancy, and barrier constraints.</w:t>
       </w:r>
     </w:p>
     <w:p>
@@ -8225,7 +8319,7 @@
         <w:spacing w:after="60"/>
       </w:pPr>
       <w:r>
-        <w:t>tma_legality: affine source range, rectangular or strided tile shape, alignment, compatible destination layout, boundary policy, and alias-safety conditions.</w:t>
+        <w:t>tma_candidate: whether the source and destination form a regular multidimensional transfer suitable for TMA.</w:t>
       </w:r>
     </w:p>
     <w:p>
@@ -8234,7 +8328,7 @@
         <w:spacing w:after="60"/>
       </w:pPr>
       <w:r>
-        <w:t>arrival_and_wait_requirements: barrier or mbarrier requirements between async arrival and consuming warp, warpgroup, or CTA.</w:t>
+        <w:t>tma_legality: affine source range, rectangular or strided tile shape, alignment, compatible destination layout, boundary policy, and alias-safety conditions.</w:t>
       </w:r>
     </w:p>
     <w:p>
@@ -8243,6 +8337,15 @@
         <w:spacing w:after="60"/>
       </w:pPr>
       <w:r>
+        <w:t>arrival_and_wait_requirements: barrier or mbarrier requirements between async arrival and consuming warp, warpgroup, or CTA.</w:t>
+      </w:r>
+    </w:p>
+    <w:p>
+      <w:pPr>
+        <w:pStyle w:val="ListBullet"/>
+        <w:spacing w:after="60"/>
+      </w:pPr>
+      <w:r>
         <w:t>fallback_movement_candidates: cp.async, vectorized LDG plus SMEM store, ordinary LDG/STG, or demand load when TMA is illegal or not profitable.</w:t>
       </w:r>
     </w:p>
@@ -8251,7 +8354,7 @@
         <w:spacing w:after="120"/>
       </w:pPr>
       <w:r>
-        <w:t>P8 consumes those hints to build CommonFetchPlanIR and CommonPipelineIR. A P8 plan should bind the selected movement engine, source/destination memory levels, stage count, prefetch distance, arrival barrier, consumer wait point, edge-tile behavior, and fallback path. The profitability model should charge only the unhidden portion of movement latency, so the plan selection explicitly asks whether the P7.4 tile and P8 pipeline together reduce compute-unit bubbles.</w:t>
+        <w:t>P8 builds CommonFetchPlanIR and CommonPipelineIR for each candidate: proposed engine, memory levels, stage count, prefetch distance, arrival barrier, wait and release/overwrite points, edges, and fallback. P9 selects after dynamic synchronization, SMEM bank effects, occupancy, and unhidden movement are charged. Staging must reduce compute-unit bubbles relative to the matching direct/cache-served path, not merely use an available async instruction.</w:t>
       </w:r>
     </w:p>
     <w:p>
@@ -9813,6 +9916,14 @@
       </w:pPr>
       <w:r>
         <w:t>Represent layout conversion as an explicit evolution edge with cost and validity conditions.</w:t>
+      </w:r>
+    </w:p>
+    <w:p>
+      <w:pPr>
+        <w:pStyle w:val="ListBullet"/>
+      </w:pPr>
+      <w:r>
+        <w:t>Do not conflate persistent GMEM storage with lane access or transient SMEM/register layout. Lane remapping need not move the tensor; GMEM repacking requires allocation, conversion, lifetime, and amortization decisions.</w:t>
       </w:r>
     </w:p>
     <w:p>

</xml_diff>